<commit_message>
updates for 2026 (#75)
* updates for 2026

* remove form, fix link
</commit_message>
<xml_diff>
--- a/docs/_resources/forms/offer_letter.docx
+++ b/docs/_resources/forms/offer_letter.docx
@@ -215,7 +215,7 @@
         <w:t>2</w:t>
       </w:r>
       <w:r>
-        <w:t>5</w:t>
+        <w:t>6</w:t>
       </w:r>
       <w:r>
         <w:t xml:space="preserve"> </w:t>
@@ -242,106 +242,103 @@
         <w:t xml:space="preserve"> </w:t>
       </w:r>
       <w:r>
+        <w:t>June</w:t>
+      </w:r>
+      <w:r>
+        <w:t xml:space="preserve"> </w:t>
+      </w:r>
+      <w:r>
+        <w:t>1</w:t>
+      </w:r>
+      <w:r>
+        <w:t>, 20</w:t>
+      </w:r>
+      <w:r>
+        <w:t>2</w:t>
+      </w:r>
+      <w:r>
+        <w:t>6</w:t>
+      </w:r>
+      <w:r>
+        <w:t>,</w:t>
+      </w:r>
+      <w:r>
+        <w:t xml:space="preserve"> </w:t>
+      </w:r>
+      <w:r>
+        <w:t>to</w:t>
+      </w:r>
+      <w:r>
+        <w:t xml:space="preserve"> </w:t>
+      </w:r>
+      <w:r>
+        <w:t>Fri</w:t>
+      </w:r>
+      <w:r>
+        <w:t>day</w:t>
+      </w:r>
+      <w:r>
+        <w:t xml:space="preserve">, </w:t>
+      </w:r>
+      <w:r>
+        <w:t xml:space="preserve">August </w:t>
+      </w:r>
+      <w:r>
+        <w:t>7</w:t>
+      </w:r>
+      <w:r>
+        <w:t xml:space="preserve">, </w:t>
+      </w:r>
+      <w:r>
+        <w:t>202</w:t>
+      </w:r>
+      <w:r>
+        <w:t>6</w:t>
+      </w:r>
+      <w:r>
+        <w:t>,</w:t>
+      </w:r>
+      <w:r>
+        <w:t xml:space="preserve"> </w:t>
+      </w:r>
+      <w:r>
+        <w:t>at Iowa State University</w:t>
+      </w:r>
+      <w:r>
+        <w:t xml:space="preserve">.  </w:t>
+      </w:r>
+      <w:r>
+        <w:t xml:space="preserve">Interns will travel to the ISU campus on </w:t>
+      </w:r>
+      <w:r>
+        <w:t>Sun</w:t>
+      </w:r>
+      <w:r>
+        <w:t xml:space="preserve">day, </w:t>
+      </w:r>
+      <w:r>
         <w:t xml:space="preserve">May </w:t>
       </w:r>
       <w:r>
+        <w:t>31</w:t>
+      </w:r>
+      <w:r>
+        <w:t>,</w:t>
+      </w:r>
+      <w:r>
+        <w:t xml:space="preserve"> and will travel home on Saturday, August </w:t>
+      </w:r>
+      <w:r>
+        <w:t>8</w:t>
+      </w:r>
+      <w:r>
+        <w:t>, 20</w:t>
+      </w:r>
+      <w:r>
         <w:t>2</w:t>
       </w:r>
       <w:r>
         <w:t>6</w:t>
-      </w:r>
-      <w:r>
-        <w:t>, 20</w:t>
-      </w:r>
-      <w:r>
-        <w:t>2</w:t>
-      </w:r>
-      <w:r>
-        <w:t>5</w:t>
-      </w:r>
-      <w:r>
-        <w:t>,</w:t>
-      </w:r>
-      <w:r>
-        <w:t xml:space="preserve"> </w:t>
-      </w:r>
-      <w:r>
-        <w:t>to</w:t>
-      </w:r>
-      <w:r>
-        <w:t xml:space="preserve"> </w:t>
-      </w:r>
-      <w:r>
-        <w:t>Fri</w:t>
-      </w:r>
-      <w:r>
-        <w:t>day</w:t>
-      </w:r>
-      <w:r>
-        <w:t xml:space="preserve">, </w:t>
-      </w:r>
-      <w:r>
-        <w:t xml:space="preserve">August </w:t>
-      </w:r>
-      <w:r>
-        <w:t>1</w:t>
-      </w:r>
-      <w:r>
-        <w:t xml:space="preserve">, </w:t>
-      </w:r>
-      <w:r>
-        <w:t>202</w:t>
-      </w:r>
-      <w:r>
-        <w:t>5</w:t>
-      </w:r>
-      <w:r>
-        <w:t>,</w:t>
-      </w:r>
-      <w:r>
-        <w:t xml:space="preserve"> </w:t>
-      </w:r>
-      <w:r>
-        <w:t>at Iowa State University</w:t>
-      </w:r>
-      <w:r>
-        <w:t xml:space="preserve">.  </w:t>
-      </w:r>
-      <w:r>
-        <w:t xml:space="preserve">Interns will travel to the ISU campus on </w:t>
-      </w:r>
-      <w:r>
-        <w:t>Sun</w:t>
-      </w:r>
-      <w:r>
-        <w:t xml:space="preserve">day, </w:t>
-      </w:r>
-      <w:r>
-        <w:t xml:space="preserve">May </w:t>
-      </w:r>
-      <w:r>
-        <w:t>2</w:t>
-      </w:r>
-      <w:r>
-        <w:t>5</w:t>
-      </w:r>
-      <w:r>
-        <w:t>,</w:t>
-      </w:r>
-      <w:r>
-        <w:t xml:space="preserve"> and will travel home on Saturday, August </w:t>
-      </w:r>
-      <w:r>
-        <w:t>2</w:t>
-      </w:r>
-      <w:r>
-        <w:t>, 20</w:t>
-      </w:r>
-      <w:r>
-        <w:t>2</w:t>
-      </w:r>
-      <w:r>
-        <w:t>5</w:t>
       </w:r>
       <w:r>
         <w:t xml:space="preserve">. </w:t>
@@ -877,7 +874,7 @@
         <w:t>2</w:t>
       </w:r>
       <w:r>
-        <w:t>5</w:t>
+        <w:t>6</w:t>
       </w:r>
       <w:r>
         <w:t xml:space="preserve"> </w:t>
@@ -1547,7 +1544,7 @@
                         </a:ln>
                         <a:extLst>
                           <a:ext uri="{909E8E84-426E-40dd-AFC4-6F175D3DCCD1}">
-                            <a14:hiddenFill xmlns:mo="http://schemas.microsoft.com/office/mac/office/2008/main" xmlns:mv="urn:schemas-microsoft-com:mac:vml" xmlns="" xmlns:o="urn:schemas-microsoft-com:office:office" xmlns:v="urn:schemas-microsoft-com:vml" xmlns:w10="urn:schemas-microsoft-com:office:word" xmlns:w="http://schemas.openxmlformats.org/wordprocessingml/2006/main" xmlns:a14="http://schemas.microsoft.com/office/drawing/2010/main">
+                            <a14:hiddenFill xmlns:a14="http://schemas.microsoft.com/office/drawing/2010/main" xmlns:w="http://schemas.openxmlformats.org/wordprocessingml/2006/main" xmlns:w10="urn:schemas-microsoft-com:office:word" xmlns:v="urn:schemas-microsoft-com:vml" xmlns:o="urn:schemas-microsoft-com:office:office" xmlns="" xmlns:mv="urn:schemas-microsoft-com:mac:vml" xmlns:mo="http://schemas.microsoft.com/office/mac/office/2008/main">
                               <a:noFill/>
                             </a14:hiddenFill>
                           </a:ext>
@@ -1650,7 +1647,7 @@
                         </a:ln>
                         <a:extLst>
                           <a:ext uri="{909E8E84-426E-40dd-AFC4-6F175D3DCCD1}">
-                            <a14:hiddenFill xmlns:mo="http://schemas.microsoft.com/office/mac/office/2008/main" xmlns:mv="urn:schemas-microsoft-com:mac:vml" xmlns="" xmlns:o="urn:schemas-microsoft-com:office:office" xmlns:v="urn:schemas-microsoft-com:vml" xmlns:w10="urn:schemas-microsoft-com:office:word" xmlns:w="http://schemas.openxmlformats.org/wordprocessingml/2006/main" xmlns:a14="http://schemas.microsoft.com/office/drawing/2010/main">
+                            <a14:hiddenFill xmlns:a14="http://schemas.microsoft.com/office/drawing/2010/main" xmlns:w="http://schemas.openxmlformats.org/wordprocessingml/2006/main" xmlns:w10="urn:schemas-microsoft-com:office:word" xmlns:v="urn:schemas-microsoft-com:vml" xmlns:o="urn:schemas-microsoft-com:office:office" xmlns="" xmlns:mv="urn:schemas-microsoft-com:mac:vml" xmlns:mo="http://schemas.microsoft.com/office/mac/office/2008/main">
                               <a:noFill/>
                             </a14:hiddenFill>
                           </a:ext>
@@ -1744,7 +1741,7 @@
                         </a:ln>
                         <a:extLst>
                           <a:ext uri="{909E8E84-426E-40dd-AFC4-6F175D3DCCD1}">
-                            <a14:hiddenFill xmlns:mo="http://schemas.microsoft.com/office/mac/office/2008/main" xmlns:mv="urn:schemas-microsoft-com:mac:vml" xmlns="" xmlns:o="urn:schemas-microsoft-com:office:office" xmlns:v="urn:schemas-microsoft-com:vml" xmlns:w10="urn:schemas-microsoft-com:office:word" xmlns:w="http://schemas.openxmlformats.org/wordprocessingml/2006/main" xmlns:a14="http://schemas.microsoft.com/office/drawing/2010/main">
+                            <a14:hiddenFill xmlns:a14="http://schemas.microsoft.com/office/drawing/2010/main" xmlns:w="http://schemas.openxmlformats.org/wordprocessingml/2006/main" xmlns:w10="urn:schemas-microsoft-com:office:word" xmlns:v="urn:schemas-microsoft-com:vml" xmlns:o="urn:schemas-microsoft-com:office:office" xmlns="" xmlns:mv="urn:schemas-microsoft-com:mac:vml" xmlns:mo="http://schemas.microsoft.com/office/mac/office/2008/main">
                               <a:noFill/>
                             </a14:hiddenFill>
                           </a:ext>
@@ -1840,7 +1837,7 @@
                         </a:ln>
                         <a:extLst>
                           <a:ext uri="{909E8E84-426E-40dd-AFC4-6F175D3DCCD1}">
-                            <a14:hiddenFill xmlns:mo="http://schemas.microsoft.com/office/mac/office/2008/main" xmlns:mv="urn:schemas-microsoft-com:mac:vml" xmlns="" xmlns:o="urn:schemas-microsoft-com:office:office" xmlns:v="urn:schemas-microsoft-com:vml" xmlns:w10="urn:schemas-microsoft-com:office:word" xmlns:w="http://schemas.openxmlformats.org/wordprocessingml/2006/main" xmlns:a14="http://schemas.microsoft.com/office/drawing/2010/main">
+                            <a14:hiddenFill xmlns:a14="http://schemas.microsoft.com/office/drawing/2010/main" xmlns:w="http://schemas.openxmlformats.org/wordprocessingml/2006/main" xmlns:w10="urn:schemas-microsoft-com:office:word" xmlns:v="urn:schemas-microsoft-com:vml" xmlns:o="urn:schemas-microsoft-com:office:office" xmlns="" xmlns:mv="urn:schemas-microsoft-com:mac:vml" xmlns:mo="http://schemas.microsoft.com/office/mac/office/2008/main">
                               <a:noFill/>
                             </a14:hiddenFill>
                           </a:ext>
@@ -1967,7 +1964,7 @@
                         </a:ln>
                         <a:extLst>
                           <a:ext uri="{909E8E84-426E-40dd-AFC4-6F175D3DCCD1}">
-                            <a14:hiddenFill xmlns:mo="http://schemas.microsoft.com/office/mac/office/2008/main" xmlns:mv="urn:schemas-microsoft-com:mac:vml" xmlns="" xmlns:o="urn:schemas-microsoft-com:office:office" xmlns:v="urn:schemas-microsoft-com:vml" xmlns:w10="urn:schemas-microsoft-com:office:word" xmlns:w="http://schemas.openxmlformats.org/wordprocessingml/2006/main" xmlns:a14="http://schemas.microsoft.com/office/drawing/2010/main">
+                            <a14:hiddenFill xmlns:a14="http://schemas.microsoft.com/office/drawing/2010/main" xmlns:w="http://schemas.openxmlformats.org/wordprocessingml/2006/main" xmlns:w10="urn:schemas-microsoft-com:office:word" xmlns:v="urn:schemas-microsoft-com:vml" xmlns:o="urn:schemas-microsoft-com:office:office" xmlns="" xmlns:mv="urn:schemas-microsoft-com:mac:vml" xmlns:mo="http://schemas.microsoft.com/office/mac/office/2008/main">
                               <a:noFill/>
                             </a14:hiddenFill>
                           </a:ext>
@@ -2045,7 +2042,7 @@
                         </a:ln>
                         <a:extLst>
                           <a:ext uri="{909E8E84-426E-40dd-AFC4-6F175D3DCCD1}">
-                            <a14:hiddenFill xmlns:mo="http://schemas.microsoft.com/office/mac/office/2008/main" xmlns:mv="urn:schemas-microsoft-com:mac:vml" xmlns="" xmlns:o="urn:schemas-microsoft-com:office:office" xmlns:v="urn:schemas-microsoft-com:vml" xmlns:w10="urn:schemas-microsoft-com:office:word" xmlns:w="http://schemas.openxmlformats.org/wordprocessingml/2006/main" xmlns:a14="http://schemas.microsoft.com/office/drawing/2010/main">
+                            <a14:hiddenFill xmlns:a14="http://schemas.microsoft.com/office/drawing/2010/main" xmlns:w="http://schemas.openxmlformats.org/wordprocessingml/2006/main" xmlns:w10="urn:schemas-microsoft-com:office:word" xmlns:v="urn:schemas-microsoft-com:vml" xmlns:o="urn:schemas-microsoft-com:office:office" xmlns="" xmlns:mv="urn:schemas-microsoft-com:mac:vml" xmlns:mo="http://schemas.microsoft.com/office/mac/office/2008/main">
                               <a:noFill/>
                             </a14:hiddenFill>
                           </a:ext>
@@ -2079,19 +2076,16 @@
         <w:t>05/</w:t>
       </w:r>
       <w:r>
+        <w:t>31</w:t>
+      </w:r>
+      <w:r>
+        <w:t>/20</w:t>
+      </w:r>
+      <w:r>
         <w:t>2</w:t>
       </w:r>
       <w:r>
-        <w:t>5</w:t>
-      </w:r>
-      <w:r>
-        <w:t>/20</w:t>
-      </w:r>
-      <w:r>
-        <w:t>2</w:t>
-      </w:r>
-      <w:r>
-        <w:t>5</w:t>
+        <w:t>6</w:t>
       </w:r>
     </w:p>
     <w:p>
@@ -2157,7 +2151,7 @@
                         </a:ln>
                         <a:extLst>
                           <a:ext uri="{909E8E84-426E-40dd-AFC4-6F175D3DCCD1}">
-                            <a14:hiddenFill xmlns:mo="http://schemas.microsoft.com/office/mac/office/2008/main" xmlns:mv="urn:schemas-microsoft-com:mac:vml" xmlns="" xmlns:o="urn:schemas-microsoft-com:office:office" xmlns:v="urn:schemas-microsoft-com:vml" xmlns:w10="urn:schemas-microsoft-com:office:word" xmlns:w="http://schemas.openxmlformats.org/wordprocessingml/2006/main" xmlns:a14="http://schemas.microsoft.com/office/drawing/2010/main">
+                            <a14:hiddenFill xmlns:a14="http://schemas.microsoft.com/office/drawing/2010/main" xmlns:w="http://schemas.openxmlformats.org/wordprocessingml/2006/main" xmlns:w10="urn:schemas-microsoft-com:office:word" xmlns:v="urn:schemas-microsoft-com:vml" xmlns:o="urn:schemas-microsoft-com:office:office" xmlns="" xmlns:mv="urn:schemas-microsoft-com:mac:vml" xmlns:mo="http://schemas.microsoft.com/office/mac/office/2008/main">
                               <a:noFill/>
                             </a14:hiddenFill>
                           </a:ext>
@@ -2194,16 +2188,16 @@
         <w:t>08/0</w:t>
       </w:r>
       <w:r>
+        <w:t>8</w:t>
+      </w:r>
+      <w:r>
+        <w:t>/20</w:t>
+      </w:r>
+      <w:r>
         <w:t>2</w:t>
       </w:r>
       <w:r>
-        <w:t>/20</w:t>
-      </w:r>
-      <w:r>
-        <w:t>2</w:t>
-      </w:r>
-      <w:r>
-        <w:t>5</w:t>
+        <w:t>6</w:t>
       </w:r>
     </w:p>
     <w:p/>
@@ -5883,7 +5877,6 @@
         </w:rPr>
         <w:t xml:space="preserve"> </w:t>
       </w:r>
-      <w:proofErr w:type="gramStart"/>
       <w:r>
         <w:rPr>
           <w:rFonts w:ascii="Times New Roman" w:hAnsi="Times New Roman"/>
@@ -5903,7 +5896,6 @@
         </w:rPr>
         <w:t>expectations</w:t>
       </w:r>
-      <w:proofErr w:type="gramEnd"/>
       <w:r>
         <w:rPr>
           <w:rFonts w:ascii="Times New Roman" w:hAnsi="Times New Roman"/>
@@ -5939,19 +5931,55 @@
         <w:rPr>
           <w:rFonts w:ascii="Times New Roman" w:hAnsi="Times New Roman"/>
         </w:rPr>
-        <w:t>day, May 2</w:t>
+        <w:t xml:space="preserve">day, May </w:t>
       </w:r>
       <w:r>
         <w:rPr>
           <w:rFonts w:ascii="Times New Roman" w:hAnsi="Times New Roman"/>
         </w:rPr>
-        <w:t>5</w:t>
+        <w:t>31</w:t>
       </w:r>
       <w:r>
         <w:rPr>
           <w:rFonts w:ascii="Times New Roman" w:hAnsi="Times New Roman"/>
         </w:rPr>
-        <w:t>, 2025, to Saturday, August 2, 2025.</w:t>
+        <w:t>, 202</w:t>
+      </w:r>
+      <w:r>
+        <w:rPr>
+          <w:rFonts w:ascii="Times New Roman" w:hAnsi="Times New Roman"/>
+        </w:rPr>
+        <w:t>6</w:t>
+      </w:r>
+      <w:r>
+        <w:rPr>
+          <w:rFonts w:ascii="Times New Roman" w:hAnsi="Times New Roman"/>
+        </w:rPr>
+        <w:t xml:space="preserve">, to Saturday, August </w:t>
+      </w:r>
+      <w:r>
+        <w:rPr>
+          <w:rFonts w:ascii="Times New Roman" w:hAnsi="Times New Roman"/>
+        </w:rPr>
+        <w:t>8</w:t>
+      </w:r>
+      <w:r>
+        <w:rPr>
+          <w:rFonts w:ascii="Times New Roman" w:hAnsi="Times New Roman"/>
+        </w:rPr>
+        <w:t>, 202</w:t>
+      </w:r>
+      <w:r>
+        <w:rPr>
+          <w:rFonts w:ascii="Times New Roman" w:hAnsi="Times New Roman"/>
+        </w:rPr>
+        <w:t>6</w:t>
+      </w:r>
+      <w:r>
+        <w:rPr>
+          <w:rFonts w:ascii="Times New Roman" w:hAnsi="Times New Roman"/>
+        </w:rPr>
+        <w:t>.</w:t>
       </w:r>
     </w:p>
     <w:p>

</xml_diff>

<commit_message>
more references, update letter
</commit_message>
<xml_diff>
--- a/docs/_resources/forms/offer_letter.docx
+++ b/docs/_resources/forms/offer_letter.docx
@@ -666,14 +666,16 @@
         <w:rPr>
           <w:b/>
         </w:rPr>
-        <w:t>18</w:t>
-      </w:r>
-      <w:r>
-        <w:rPr>
-          <w:b/>
-        </w:rPr>
-        <w:t>th</w:t>
-      </w:r>
+        <w:t xml:space="preserve">3 </w:t>
+      </w:r>
+      <w:proofErr w:type="spellStart"/>
+      <w:r>
+        <w:rPr>
+          <w:b/>
+        </w:rPr>
+        <w:t>rd</w:t>
+      </w:r>
+      <w:proofErr w:type="spellEnd"/>
       <w:r>
         <w:rPr>
           <w:b/>
@@ -1544,7 +1546,7 @@
                         </a:ln>
                         <a:extLst>
                           <a:ext uri="{909E8E84-426E-40dd-AFC4-6F175D3DCCD1}">
-                            <a14:hiddenFill xmlns:a14="http://schemas.microsoft.com/office/drawing/2010/main" xmlns:w="http://schemas.openxmlformats.org/wordprocessingml/2006/main" xmlns:w10="urn:schemas-microsoft-com:office:word" xmlns:v="urn:schemas-microsoft-com:vml" xmlns:o="urn:schemas-microsoft-com:office:office" xmlns="" xmlns:mv="urn:schemas-microsoft-com:mac:vml" xmlns:mo="http://schemas.microsoft.com/office/mac/office/2008/main">
+                            <a14:hiddenFill xmlns:mo="http://schemas.microsoft.com/office/mac/office/2008/main" xmlns:mv="urn:schemas-microsoft-com:mac:vml" xmlns="" xmlns:o="urn:schemas-microsoft-com:office:office" xmlns:v="urn:schemas-microsoft-com:vml" xmlns:w10="urn:schemas-microsoft-com:office:word" xmlns:w="http://schemas.openxmlformats.org/wordprocessingml/2006/main" xmlns:a14="http://schemas.microsoft.com/office/drawing/2010/main">
                               <a:noFill/>
                             </a14:hiddenFill>
                           </a:ext>
@@ -1647,7 +1649,7 @@
                         </a:ln>
                         <a:extLst>
                           <a:ext uri="{909E8E84-426E-40dd-AFC4-6F175D3DCCD1}">
-                            <a14:hiddenFill xmlns:a14="http://schemas.microsoft.com/office/drawing/2010/main" xmlns:w="http://schemas.openxmlformats.org/wordprocessingml/2006/main" xmlns:w10="urn:schemas-microsoft-com:office:word" xmlns:v="urn:schemas-microsoft-com:vml" xmlns:o="urn:schemas-microsoft-com:office:office" xmlns="" xmlns:mv="urn:schemas-microsoft-com:mac:vml" xmlns:mo="http://schemas.microsoft.com/office/mac/office/2008/main">
+                            <a14:hiddenFill xmlns:mo="http://schemas.microsoft.com/office/mac/office/2008/main" xmlns:mv="urn:schemas-microsoft-com:mac:vml" xmlns="" xmlns:o="urn:schemas-microsoft-com:office:office" xmlns:v="urn:schemas-microsoft-com:vml" xmlns:w10="urn:schemas-microsoft-com:office:word" xmlns:w="http://schemas.openxmlformats.org/wordprocessingml/2006/main" xmlns:a14="http://schemas.microsoft.com/office/drawing/2010/main">
                               <a:noFill/>
                             </a14:hiddenFill>
                           </a:ext>
@@ -1741,7 +1743,7 @@
                         </a:ln>
                         <a:extLst>
                           <a:ext uri="{909E8E84-426E-40dd-AFC4-6F175D3DCCD1}">
-                            <a14:hiddenFill xmlns:a14="http://schemas.microsoft.com/office/drawing/2010/main" xmlns:w="http://schemas.openxmlformats.org/wordprocessingml/2006/main" xmlns:w10="urn:schemas-microsoft-com:office:word" xmlns:v="urn:schemas-microsoft-com:vml" xmlns:o="urn:schemas-microsoft-com:office:office" xmlns="" xmlns:mv="urn:schemas-microsoft-com:mac:vml" xmlns:mo="http://schemas.microsoft.com/office/mac/office/2008/main">
+                            <a14:hiddenFill xmlns:mo="http://schemas.microsoft.com/office/mac/office/2008/main" xmlns:mv="urn:schemas-microsoft-com:mac:vml" xmlns="" xmlns:o="urn:schemas-microsoft-com:office:office" xmlns:v="urn:schemas-microsoft-com:vml" xmlns:w10="urn:schemas-microsoft-com:office:word" xmlns:w="http://schemas.openxmlformats.org/wordprocessingml/2006/main" xmlns:a14="http://schemas.microsoft.com/office/drawing/2010/main">
                               <a:noFill/>
                             </a14:hiddenFill>
                           </a:ext>
@@ -1837,7 +1839,7 @@
                         </a:ln>
                         <a:extLst>
                           <a:ext uri="{909E8E84-426E-40dd-AFC4-6F175D3DCCD1}">
-                            <a14:hiddenFill xmlns:a14="http://schemas.microsoft.com/office/drawing/2010/main" xmlns:w="http://schemas.openxmlformats.org/wordprocessingml/2006/main" xmlns:w10="urn:schemas-microsoft-com:office:word" xmlns:v="urn:schemas-microsoft-com:vml" xmlns:o="urn:schemas-microsoft-com:office:office" xmlns="" xmlns:mv="urn:schemas-microsoft-com:mac:vml" xmlns:mo="http://schemas.microsoft.com/office/mac/office/2008/main">
+                            <a14:hiddenFill xmlns:mo="http://schemas.microsoft.com/office/mac/office/2008/main" xmlns:mv="urn:schemas-microsoft-com:mac:vml" xmlns="" xmlns:o="urn:schemas-microsoft-com:office:office" xmlns:v="urn:schemas-microsoft-com:vml" xmlns:w10="urn:schemas-microsoft-com:office:word" xmlns:w="http://schemas.openxmlformats.org/wordprocessingml/2006/main" xmlns:a14="http://schemas.microsoft.com/office/drawing/2010/main">
                               <a:noFill/>
                             </a14:hiddenFill>
                           </a:ext>
@@ -1964,7 +1966,7 @@
                         </a:ln>
                         <a:extLst>
                           <a:ext uri="{909E8E84-426E-40dd-AFC4-6F175D3DCCD1}">
-                            <a14:hiddenFill xmlns:a14="http://schemas.microsoft.com/office/drawing/2010/main" xmlns:w="http://schemas.openxmlformats.org/wordprocessingml/2006/main" xmlns:w10="urn:schemas-microsoft-com:office:word" xmlns:v="urn:schemas-microsoft-com:vml" xmlns:o="urn:schemas-microsoft-com:office:office" xmlns="" xmlns:mv="urn:schemas-microsoft-com:mac:vml" xmlns:mo="http://schemas.microsoft.com/office/mac/office/2008/main">
+                            <a14:hiddenFill xmlns:mo="http://schemas.microsoft.com/office/mac/office/2008/main" xmlns:mv="urn:schemas-microsoft-com:mac:vml" xmlns="" xmlns:o="urn:schemas-microsoft-com:office:office" xmlns:v="urn:schemas-microsoft-com:vml" xmlns:w10="urn:schemas-microsoft-com:office:word" xmlns:w="http://schemas.openxmlformats.org/wordprocessingml/2006/main" xmlns:a14="http://schemas.microsoft.com/office/drawing/2010/main">
                               <a:noFill/>
                             </a14:hiddenFill>
                           </a:ext>
@@ -2042,7 +2044,7 @@
                         </a:ln>
                         <a:extLst>
                           <a:ext uri="{909E8E84-426E-40dd-AFC4-6F175D3DCCD1}">
-                            <a14:hiddenFill xmlns:a14="http://schemas.microsoft.com/office/drawing/2010/main" xmlns:w="http://schemas.openxmlformats.org/wordprocessingml/2006/main" xmlns:w10="urn:schemas-microsoft-com:office:word" xmlns:v="urn:schemas-microsoft-com:vml" xmlns:o="urn:schemas-microsoft-com:office:office" xmlns="" xmlns:mv="urn:schemas-microsoft-com:mac:vml" xmlns:mo="http://schemas.microsoft.com/office/mac/office/2008/main">
+                            <a14:hiddenFill xmlns:mo="http://schemas.microsoft.com/office/mac/office/2008/main" xmlns:mv="urn:schemas-microsoft-com:mac:vml" xmlns="" xmlns:o="urn:schemas-microsoft-com:office:office" xmlns:v="urn:schemas-microsoft-com:vml" xmlns:w10="urn:schemas-microsoft-com:office:word" xmlns:w="http://schemas.openxmlformats.org/wordprocessingml/2006/main" xmlns:a14="http://schemas.microsoft.com/office/drawing/2010/main">
                               <a:noFill/>
                             </a14:hiddenFill>
                           </a:ext>
@@ -2151,7 +2153,7 @@
                         </a:ln>
                         <a:extLst>
                           <a:ext uri="{909E8E84-426E-40dd-AFC4-6F175D3DCCD1}">
-                            <a14:hiddenFill xmlns:a14="http://schemas.microsoft.com/office/drawing/2010/main" xmlns:w="http://schemas.openxmlformats.org/wordprocessingml/2006/main" xmlns:w10="urn:schemas-microsoft-com:office:word" xmlns:v="urn:schemas-microsoft-com:vml" xmlns:o="urn:schemas-microsoft-com:office:office" xmlns="" xmlns:mv="urn:schemas-microsoft-com:mac:vml" xmlns:mo="http://schemas.microsoft.com/office/mac/office/2008/main">
+                            <a14:hiddenFill xmlns:mo="http://schemas.microsoft.com/office/mac/office/2008/main" xmlns:mv="urn:schemas-microsoft-com:mac:vml" xmlns="" xmlns:o="urn:schemas-microsoft-com:office:office" xmlns:v="urn:schemas-microsoft-com:vml" xmlns:w10="urn:schemas-microsoft-com:office:word" xmlns:w="http://schemas.openxmlformats.org/wordprocessingml/2006/main" xmlns:a14="http://schemas.microsoft.com/office/drawing/2010/main">
                               <a:noFill/>
                             </a14:hiddenFill>
                           </a:ext>

</xml_diff>